<commit_message>
Handoff: drop the next-screen material, it belongs to the younger product
Frank: "please do not take what I said about link to the next screen
literally. That device is not part of what I am asking you to do here."

Removed from the handoff: the boxed WordPower "Intelligent Jumps"
correction, and the next-word row in the incumbent-weakness table. Neither
is an EZvoxa claim, and carrying them implied one. The refutation stays in
DECISIONS and in the research folder, which is where it belongs.

Also recorded: he has something much larger in mind for the younger
children, not yet described, so nothing existing should be read as his
intent for it.

Handoff now 9,506 words. Schema validated.
</commit_message>
<xml_diff>
--- a/EZvoxa Business and Product Handoff.docx
+++ b/EZvoxa Business and Product Handoff.docx
@@ -17915,165 +17915,6 @@
                 <w:szCs w:val="19"/>
               </w:rPr>
               <w:t xml:space="preserve">Maker documentation</w:t>
-            </w:r>
-          </w:p>
-        </w:tc>
-      </w:tr>
-      <w:tr>
-        <w:tc>
-          <w:tcPr>
-            <w:tcW w:type="dxa" w:w="1713"/>
-            <w:tcBorders>
-              <w:top w:val="single" w:color="C3CBDA" w:sz="3"/>
-              <w:left w:val="none"/>
-              <w:bottom w:val="single" w:color="C3CBDA" w:sz="3"/>
-              <w:right w:val="none"/>
-            </w:tcBorders>
-            <w:shd w:fill="FFFFFF" w:color="auto" w:val="clear"/>
-            <w:tcMar>
-              <w:top w:type="dxa" w:w="70"/>
-              <w:left w:type="dxa" w:w="110"/>
-              <w:bottom w:type="dxa" w:w="70"/>
-              <w:right w:type="dxa" w:w="110"/>
-            </w:tcMar>
-          </w:tcPr>
-          <w:p>
-            <w:pPr>
-              <w:spacing w:after="0" w:before="0" w:line="276"/>
-            </w:pPr>
-            <w:r>
-              <w:rPr>
-                <w:rFonts w:ascii="Calibri" w:cs="Calibri" w:eastAsia="Calibri" w:hAnsi="Calibri"/>
-                <w:b w:val="false"/>
-                <w:bCs w:val="false"/>
-                <w:color w:val="1B2333"/>
-                <w:sz w:val="19"/>
-                <w:szCs w:val="19"/>
-              </w:rPr>
-              <w:t xml:space="preserve">Next word behavior</w:t>
-            </w:r>
-          </w:p>
-        </w:tc>
-        <w:tc>
-          <w:tcPr>
-            <w:tcW w:type="dxa" w:w="6350"/>
-            <w:tcBorders>
-              <w:top w:val="single" w:color="C3CBDA" w:sz="3"/>
-              <w:left w:val="none"/>
-              <w:bottom w:val="single" w:color="C3CBDA" w:sz="3"/>
-              <w:right w:val="none"/>
-            </w:tcBorders>
-            <w:shd w:fill="FFFFFF" w:color="auto" w:val="clear"/>
-            <w:tcMar>
-              <w:top w:type="dxa" w:w="70"/>
-              <w:left w:type="dxa" w:w="110"/>
-              <w:bottom w:type="dxa" w:w="70"/>
-              <w:right w:type="dxa" w:w="110"/>
-            </w:tcMar>
-          </w:tcPr>
-          <w:p>
-            <w:pPr>
-              <w:spacing w:after="0" w:before="0" w:line="276"/>
-            </w:pPr>
-            <w:r>
-              <w:rPr>
-                <w:rFonts w:ascii="Calibri" w:cs="Calibri" w:eastAsia="Calibri" w:hAnsi="Calibri"/>
-                <w:b w:val="false"/>
-                <w:bCs w:val="false"/>
-                <w:color w:val="1B2333"/>
-                <w:sz w:val="19"/>
-                <w:szCs w:val="19"/>
-              </w:rPr>
-              <w:t xml:space="preserve">One vocabulary has shipped rule-based next-word navigation for years, documented as intelligent jumps and logical next words. It is hand-authored by a speech pathologist and updated by release. Everything else offers prediction only when typing, or changes a button’s label in place without navigating.</w:t>
-            </w:r>
-          </w:p>
-        </w:tc>
-        <w:tc>
-          <w:tcPr>
-            <w:tcW w:type="dxa" w:w="2017"/>
-            <w:tcBorders>
-              <w:top w:val="single" w:color="C3CBDA" w:sz="3"/>
-              <w:left w:val="none"/>
-              <w:bottom w:val="single" w:color="C3CBDA" w:sz="3"/>
-              <w:right w:val="none"/>
-            </w:tcBorders>
-            <w:shd w:fill="FFFFFF" w:color="auto" w:val="clear"/>
-            <w:tcMar>
-              <w:top w:type="dxa" w:w="70"/>
-              <w:left w:type="dxa" w:w="110"/>
-              <w:bottom w:type="dxa" w:w="70"/>
-              <w:right w:type="dxa" w:w="110"/>
-            </w:tcMar>
-          </w:tcPr>
-          <w:p>
-            <w:pPr>
-              <w:spacing w:after="0" w:before="0" w:line="276"/>
-            </w:pPr>
-            <w:r>
-              <w:rPr>
-                <w:rFonts w:ascii="Calibri" w:cs="Calibri" w:eastAsia="Calibri" w:hAnsi="Calibri"/>
-                <w:b w:val="false"/>
-                <w:bCs w:val="false"/>
-                <w:color w:val="1B2333"/>
-                <w:sz w:val="19"/>
-                <w:szCs w:val="19"/>
-              </w:rPr>
-              <w:t xml:space="preserve">Maker documentation, verified directly</w:t>
-            </w:r>
-          </w:p>
-        </w:tc>
-      </w:tr>
-    </w:tbl>
-    <w:p>
-      <w:pPr>
-        <w:spacing w:after="80"/>
-      </w:pPr>
-    </w:p>
-    <w:tbl>
-      <w:tblPr>
-        <w:tblW w:type="dxa" w:w="10080"/>
-        <w:tblBorders>
-          <w:top w:val="none"/>
-          <w:left w:val="none"/>
-          <w:bottom w:val="none"/>
-          <w:right w:val="none"/>
-          <w:insideH w:val="none"/>
-          <w:insideV w:val="none"/>
-        </w:tblBorders>
-      </w:tblPr>
-      <w:tblGrid>
-        <w:gridCol w:w="10080"/>
-      </w:tblGrid>
-      <w:tr>
-        <w:tc>
-          <w:tcPr>
-            <w:tcW w:type="dxa" w:w="10080"/>
-            <w:tcBorders>
-              <w:top w:val="none"/>
-              <w:left w:val="single" w:color="8A4B00" w:sz="18"/>
-              <w:bottom w:val="none"/>
-              <w:right w:val="none"/>
-            </w:tcBorders>
-            <w:shd w:fill="FDF6EC" w:color="auto" w:val="clear"/>
-            <w:tcMar>
-              <w:top w:type="dxa" w:w="160"/>
-              <w:left w:type="dxa" w:w="200"/>
-              <w:bottom w:type="dxa" w:w="160"/>
-              <w:right w:type="dxa" w:w="200"/>
-            </w:tcMar>
-          </w:tcPr>
-          <w:p>
-            <w:pPr>
-              <w:spacing w:after="0" w:before="0" w:line="276"/>
-            </w:pPr>
-            <w:r>
-              <w:rPr>
-                <w:rFonts w:ascii="Calibri" w:cs="Calibri" w:eastAsia="Calibri" w:hAnsi="Calibri"/>
-                <w:color w:val="5A3A08"/>
-                <w:sz w:val="20"/>
-                <w:szCs w:val="20"/>
-              </w:rPr>
-              <w:t xml:space="preserve">A correction that must be carried into any pitch, filing or public claim. It is NOT true that nobody links a chosen word to the next likely screen. One incumbent vocabulary has done exactly that for years and documents it on its own site. The claim that survives scrutiny is narrower and still unclaimed: nobody ships navigation that learns the individual child’s own transitions, and no symbol-based product uses machine learning to route screens. Use only the sharp form.</w:t>
             </w:r>
           </w:p>
         </w:tc>

</xml_diff>

<commit_message>
Correct a stale claim: customer emergency alerts are built, not a demo
Frank's question about the family backend surfaced an error. The handoff and
APPSTORE.md both said a customer's SOS alert was only a demonstration
because the server knew only our family's numbers. That stopped being true
on 5 Sep with the Family Code build.

api/sos.js reads fam:CODE:settings and alerts everyone that family marked,
skipping fictional numbers and never carrying our medical note. Same story
for voice, settings and text, which are all code-aware.

APPSTORE.md now carries a dated correction instead of a silent edit. The
handoff drops the row and is 9,471 words.
</commit_message>
<xml_diff>
--- a/EZvoxa Business and Product Handoff.docx
+++ b/EZvoxa Business and Product Handoff.docx
@@ -4935,7 +4935,7 @@
                 <w:sz w:val="19"/>
                 <w:szCs w:val="19"/>
               </w:rPr>
-              <w:t xml:space="preserve">The customer emergency alert. On our own phones the alert really sends. On a customer phone it is a demonstration, because the server only knows our family.</w:t>
+              <w:t xml:space="preserve">The district portal: organization accounts, join codes, seat counting, device list, sign in by emailed link.</w:t>
             </w:r>
           </w:p>
         </w:tc>
@@ -4969,7 +4969,7 @@
                 <w:sz w:val="19"/>
                 <w:szCs w:val="19"/>
               </w:rPr>
-              <w:t xml:space="preserve">Marketing the emergency feature to customers.</w:t>
+              <w:t xml:space="preserve">The entire schools channel. The website already describes this system to districts. It does not exist yet.</w:t>
             </w:r>
           </w:p>
         </w:tc>
@@ -5005,7 +5005,7 @@
                 <w:sz w:val="19"/>
                 <w:szCs w:val="19"/>
               </w:rPr>
-              <w:t xml:space="preserve">The district portal: organization accounts, join codes, seat counting, device list, sign in by emailed link.</w:t>
+              <w:t xml:space="preserve">EZvoxa Pro as its own build and its own store listing, plus its icon.</w:t>
             </w:r>
           </w:p>
         </w:tc>
@@ -5039,7 +5039,7 @@
                 <w:sz w:val="19"/>
                 <w:szCs w:val="19"/>
               </w:rPr>
-              <w:t xml:space="preserve">The entire schools channel. The website already describes this system to districts. It does not exist yet.</w:t>
+              <w:t xml:space="preserve">Selling to schools as a separate product.</w:t>
             </w:r>
           </w:p>
         </w:tc>
@@ -5075,7 +5075,7 @@
                 <w:sz w:val="19"/>
                 <w:szCs w:val="19"/>
               </w:rPr>
-              <w:t xml:space="preserve">EZvoxa Pro as its own build and its own store listing, plus its icon.</w:t>
+              <w:t xml:space="preserve">Consumer checkout on the website, and the choice of payment processor.</w:t>
             </w:r>
           </w:p>
         </w:tc>
@@ -5109,7 +5109,7 @@
                 <w:sz w:val="19"/>
                 <w:szCs w:val="19"/>
               </w:rPr>
-              <w:t xml:space="preserve">Selling to schools as a separate product.</w:t>
+              <w:t xml:space="preserve">Selling to anyone without an app store account.</w:t>
             </w:r>
           </w:p>
         </w:tc>
@@ -5145,7 +5145,7 @@
                 <w:sz w:val="19"/>
                 <w:szCs w:val="19"/>
               </w:rPr>
-              <w:t xml:space="preserve">Consumer checkout on the website, and the choice of payment processor.</w:t>
+              <w:t xml:space="preserve">The email address that receives quote requests is not configured on the server.</w:t>
             </w:r>
           </w:p>
         </w:tc>
@@ -5179,7 +5179,7 @@
                 <w:sz w:val="19"/>
                 <w:szCs w:val="19"/>
               </w:rPr>
-              <w:t xml:space="preserve">Selling to anyone without an app store account.</w:t>
+              <w:t xml:space="preserve">Nobody is notified when a district asks for a quote. Requests are stored, silently.</w:t>
             </w:r>
           </w:p>
         </w:tc>
@@ -5215,7 +5215,7 @@
                 <w:sz w:val="19"/>
                 <w:szCs w:val="19"/>
               </w:rPr>
-              <w:t xml:space="preserve">The email address that receives quote requests is not configured on the server.</w:t>
+              <w:t xml:space="preserve">No release has been cut to the customer lane, so app.ezvoxa.com is empty.</w:t>
             </w:r>
           </w:p>
         </w:tc>
@@ -5229,76 +5229,6 @@
               <w:right w:val="none"/>
             </w:tcBorders>
             <w:shd w:fill="F6F8FC" w:color="auto" w:val="clear"/>
-            <w:tcMar>
-              <w:top w:type="dxa" w:w="70"/>
-              <w:left w:type="dxa" w:w="110"/>
-              <w:bottom w:type="dxa" w:w="70"/>
-              <w:right w:type="dxa" w:w="110"/>
-            </w:tcMar>
-          </w:tcPr>
-          <w:p>
-            <w:pPr>
-              <w:spacing w:after="0" w:before="0" w:line="276"/>
-            </w:pPr>
-            <w:r>
-              <w:rPr>
-                <w:rFonts w:ascii="Calibri" w:cs="Calibri" w:eastAsia="Calibri" w:hAnsi="Calibri"/>
-                <w:b w:val="false"/>
-                <w:bCs w:val="false"/>
-                <w:color w:val="1B2333"/>
-                <w:sz w:val="19"/>
-                <w:szCs w:val="19"/>
-              </w:rPr>
-              <w:t xml:space="preserve">Nobody is notified when a district asks for a quote. Requests are stored, silently.</w:t>
-            </w:r>
-          </w:p>
-        </w:tc>
-      </w:tr>
-      <w:tr>
-        <w:tc>
-          <w:tcPr>
-            <w:tcW w:type="dxa" w:w="4636"/>
-            <w:tcBorders>
-              <w:top w:val="single" w:color="C3CBDA" w:sz="3"/>
-              <w:left w:val="none"/>
-              <w:bottom w:val="single" w:color="C3CBDA" w:sz="3"/>
-              <w:right w:val="none"/>
-            </w:tcBorders>
-            <w:shd w:fill="FFFFFF" w:color="auto" w:val="clear"/>
-            <w:tcMar>
-              <w:top w:type="dxa" w:w="70"/>
-              <w:left w:type="dxa" w:w="110"/>
-              <w:bottom w:type="dxa" w:w="70"/>
-              <w:right w:type="dxa" w:w="110"/>
-            </w:tcMar>
-          </w:tcPr>
-          <w:p>
-            <w:pPr>
-              <w:spacing w:after="0" w:before="0" w:line="276"/>
-            </w:pPr>
-            <w:r>
-              <w:rPr>
-                <w:rFonts w:ascii="Calibri" w:cs="Calibri" w:eastAsia="Calibri" w:hAnsi="Calibri"/>
-                <w:b w:val="false"/>
-                <w:bCs w:val="false"/>
-                <w:color w:val="1B2333"/>
-                <w:sz w:val="19"/>
-                <w:szCs w:val="19"/>
-              </w:rPr>
-              <w:t xml:space="preserve">No release has been cut to the customer lane, so app.ezvoxa.com is empty.</w:t>
-            </w:r>
-          </w:p>
-        </w:tc>
-        <w:tc>
-          <w:tcPr>
-            <w:tcW w:type="dxa" w:w="5444"/>
-            <w:tcBorders>
-              <w:top w:val="single" w:color="C3CBDA" w:sz="3"/>
-              <w:left w:val="none"/>
-              <w:bottom w:val="single" w:color="C3CBDA" w:sz="3"/>
-              <w:right w:val="none"/>
-            </w:tcBorders>
-            <w:shd w:fill="FFFFFF" w:color="auto" w:val="clear"/>
             <w:tcMar>
               <w:top w:type="dxa" w:w="70"/>
               <w:left w:type="dxa" w:w="110"/>

</xml_diff>

<commit_message>
Apple Developer Program is enrolled and paid, corrected everywhere
Frank, 10 Sep 2026: order #W1949990147, EZ Voice LLC, Organization, $99 a year, one-year membership, licence agreement accepted the same evening. Apple's confirmation screen matches. No verification call was needed.

Corrected in place: two LEDGER entries, APPSTORE.md step 1, and four places in the handoff document that listed enrollment as a blocker. The handoff's risk table now names Google Play, not Apple, as the store still closed.

Also recorded, not acted on: Frank's reading of the licence agreement on life-safety disclaimers and on marketing location features for emergency purposes, with his instruction that attorney review comes before the listing goes live and not before now. Flagged that the emergency framing also appears in the app copy, the website and the review notes, so a rewording pass has to cover all four.
</commit_message>
<xml_diff>
--- a/EZvoxa Business and Product Handoff.docx
+++ b/EZvoxa Business and Product Handoff.docx
@@ -4585,7 +4585,7 @@
                 <w:sz w:val="19"/>
                 <w:szCs w:val="19"/>
               </w:rPr>
-              <w:t xml:space="preserve">Apple Developer enrollment is submitted, not approved. Enrollment ID FA22WL2678, submitted 4 September 2026 as an Organization. Apple reviews the organization first, then emails a link to pay the $99.</w:t>
+              <w:t xml:space="preserve">App Store Connect not yet set up. The Apple Developer Program itself is DONE: enrolled and paid 10 September 2026, order #W1949990147, one-year Organization membership, licence agreement accepted. What remains is Agreements, Tax and Banking with the W-9, then enrolling in the Small Business Program.</w:t>
             </w:r>
           </w:p>
         </w:tc>
@@ -4619,7 +4619,7 @@
                 <w:sz w:val="19"/>
                 <w:szCs w:val="19"/>
               </w:rPr>
-              <w:t xml:space="preserve">Everything on iOS. No TestFlight, no submission, no in-app purchase products.</w:t>
+              <w:t xml:space="preserve">Submission and in-app purchase products. Note the Small Business Program in particular: enrolling in it AFTER the first sale means paying 30 percent commission instead of 15.</w:t>
             </w:r>
           </w:p>
         </w:tc>
@@ -18409,7 +18409,7 @@
                 <w:sz w:val="19"/>
                 <w:szCs w:val="19"/>
               </w:rPr>
-              <w:t xml:space="preserve">Yearly, payable once Apple approves the organization</w:t>
+              <w:t xml:space="preserve">Yearly. PAID 10 September 2026, one-year membership, so the next one falls due September 2027.</w:t>
             </w:r>
           </w:p>
         </w:tc>
@@ -18477,7 +18477,7 @@
                 <w:sz w:val="19"/>
                 <w:szCs w:val="19"/>
               </w:rPr>
-              <w:t xml:space="preserve">Apple’s enrollment page</w:t>
+              <w:t xml:space="preserve">Apple’s enrollment page, and the paid order confirmation</w:t>
             </w:r>
           </w:p>
         </w:tc>
@@ -24754,7 +24754,7 @@
                 <w:sz w:val="19"/>
                 <w:szCs w:val="19"/>
               </w:rPr>
-              <w:t xml:space="preserve">Store enrollment is not approved</w:t>
+              <w:t xml:space="preserve">Google Play account not opened</w:t>
             </w:r>
           </w:p>
         </w:tc>
@@ -24788,7 +24788,7 @@
                 <w:sz w:val="19"/>
                 <w:szCs w:val="19"/>
               </w:rPr>
-              <w:t xml:space="preserve">Two of four channels produce nothing. Everything on iOS waits on an organization review that has been pending since 4 September 2026.</w:t>
+              <w:t xml:space="preserve">One of four channels produces nothing. The Apple side cleared on 10 September 2026, so Android is now the only store still closed.</w:t>
             </w:r>
           </w:p>
         </w:tc>
@@ -25511,7 +25511,7 @@
           <w:sz w:val="21"/>
           <w:szCs w:val="21"/>
         </w:rPr>
-        <w:t xml:space="preserve">Apple organization review, then pay the $99, then the agreements, tax and banking forms, then enroll in the reduced commission tier.</w:t>
+        <w:t xml:space="preserve">Apple Developer Program is enrolled and paid. What remains on that side: App Store Connect access, the agreements, tax and banking forms with the W-9, and enrolling in the reduced commission tier before the first sale.</w:t>
       </w:r>
     </w:p>
     <w:p>

</xml_diff>